<commit_message>
docs: update MyStarExample STAR narrative
</commit_message>
<xml_diff>
--- a/MyStarExample.docx
+++ b/MyStarExample.docx
@@ -22,993 +22,413 @@
         <w:pStyle w:val="BodyText"/>
       </w:pPr>
       <w:r>
-        <w:t>This STAR example explains my involvement in the Large Multi</w:t>
-      </w:r>
-      <w:r>
-        <w:t>-</w:t>
-      </w:r>
-      <w:r>
-        <w:t>Modal Proof of Concept Project</w:t>
-      </w:r>
-      <w:r>
-        <w:t xml:space="preserve"> (Aug 2025-Apr 2026)</w:t>
-      </w:r>
-      <w:r>
-        <w:t>.</w:t>
+        <w:t xml:space="preserve">                                                                                                                   </w:t>
+      </w:r>
+    </w:p>
+    <w:p>
+      <w:pPr>
+        <w:pStyle w:val="BodyText"/>
+      </w:pPr>
+      <w:r>
+        <w:t xml:space="preserve"> This STAR example covers my involvement in the Large Multi-Modal Proof of Concept project, from August 2025 to   April 2026.                                                                                                      </w:t>
       </w:r>
     </w:p>
     <w:p>
       <w:pPr>
         <w:pStyle w:val="Heading2"/>
       </w:pPr>
-      <w:bookmarkStart w:id="1" w:name="situation"/>
       <w:r>
         <w:t>Situation</w:t>
       </w:r>
     </w:p>
     <w:p>
       <w:pPr>
-        <w:pStyle w:val="FirstParagraph"/>
-      </w:pPr>
-      <w:r>
-        <w:t>The PL191</w:t>
-      </w:r>
-      <w:r>
-        <w:t xml:space="preserve"> </w:t>
-      </w:r>
-      <w:r>
-        <w:t xml:space="preserve">Requirements </w:t>
-      </w:r>
-      <w:r>
-        <w:t>doc</w:t>
-      </w:r>
-      <w:r>
-        <w:t>uments for (Phase 1 &amp; Phase 2) of</w:t>
-      </w:r>
-      <w:r>
-        <w:t xml:space="preserve"> the Project, </w:t>
-      </w:r>
-      <w:r>
-        <w:t>specif</w:t>
-      </w:r>
-      <w:r>
-        <w:t xml:space="preserve">y </w:t>
-      </w:r>
-      <w:r>
-        <w:t>a</w:t>
-      </w:r>
-      <w:r>
-        <w:t xml:space="preserve">n </w:t>
-      </w:r>
+        <w:pStyle w:val="BodyText"/>
+      </w:pPr>
+      <w:r>
+        <w:t xml:space="preserve">  The PL191 requirements specified a structured information extraction pipeline built on open-weight Vision Language Models — VLMs. It needed to be modular, extensible, and capable of processing financial documents such as receipts, invoices, bank statements, and travel documents, at production-level throughput on our self-managed GPU cluster.</w:t>
+      </w:r>
+    </w:p>
+    <w:p>
+      <w:pPr>
+        <w:pStyle w:val="Heading2"/>
+      </w:pPr>
+      <w:bookmarkStart w:id="1" w:name="task"/>
+      <w:r>
+        <w:t>Task</w:t>
+      </w:r>
+      <w:bookmarkStart w:id="2" w:name="action"/>
+      <w:bookmarkEnd w:id="1"/>
+    </w:p>
+    <w:p>
+      <w:pPr>
+        <w:pStyle w:val="Heading2"/>
+      </w:pPr>
       <w:r>
         <w:rPr>
-          <w:i/>
-          <w:iCs/>
+          <w:rFonts w:asciiTheme="minorHAnsi" w:eastAsiaTheme="minorEastAsia" w:hAnsiTheme="minorHAnsi" w:cstheme="minorBidi"/>
+          <w:color w:val="auto"/>
+          <w:sz w:val="24"/>
+          <w:szCs w:val="24"/>
         </w:rPr>
-        <w:t xml:space="preserve">agile, </w:t>
-      </w:r>
-      <w:r>
+        <w:t xml:space="preserve">The PL191 requirements imposed three independent design pressures:                                                                           </w:t>
+      </w:r>
+    </w:p>
+    <w:p>
+      <w:pPr>
+        <w:pStyle w:val="Heading2"/>
         <w:rPr>
-          <w:i/>
-          <w:iCs/>
+          <w:rFonts w:asciiTheme="minorHAnsi" w:eastAsiaTheme="minorEastAsia" w:hAnsiTheme="minorHAnsi" w:cstheme="minorBidi"/>
+          <w:color w:val="auto"/>
+          <w:sz w:val="24"/>
+          <w:szCs w:val="24"/>
         </w:rPr>
-        <w:t>modular</w:t>
-      </w:r>
+      </w:pPr>
       <w:r>
         <w:rPr>
-          <w:i/>
-          <w:iCs/>
+          <w:rFonts w:asciiTheme="minorHAnsi" w:eastAsiaTheme="minorEastAsia" w:hAnsiTheme="minorHAnsi" w:cstheme="minorBidi"/>
+          <w:color w:val="auto"/>
+          <w:sz w:val="24"/>
+          <w:szCs w:val="24"/>
         </w:rPr>
-        <w:t xml:space="preserve"> and </w:t>
+        <w:t xml:space="preserve">  1. Document variety — new document classes will be added over time, each with different layouts, field schemas,</w:t>
       </w:r>
       <w:r>
         <w:rPr>
-          <w:i/>
-          <w:iCs/>
-        </w:rPr>
-        <w:t>extensible</w:t>
-      </w:r>
-      <w:r>
-        <w:t xml:space="preserve"> Structured Information Extraction pipeline </w:t>
-      </w:r>
-      <w:r>
-        <w:t xml:space="preserve">using available open weight </w:t>
-      </w:r>
-      <w:r>
-        <w:t xml:space="preserve">Vision Language </w:t>
-      </w:r>
-      <w:proofErr w:type="gramStart"/>
-      <w:r>
-        <w:t>Model</w:t>
-      </w:r>
-      <w:r>
-        <w:t>s</w:t>
-      </w:r>
-      <w:r>
-        <w:t>(</w:t>
-      </w:r>
-      <w:proofErr w:type="gramEnd"/>
-      <w:r>
-        <w:t>VLM’s for short).</w:t>
-      </w:r>
-      <w:r>
-        <w:t xml:space="preserve"> </w:t>
-      </w:r>
-      <w:r>
-        <w:t>The VLM’s must be</w:t>
-      </w:r>
-      <w:r>
-        <w:t xml:space="preserve"> </w:t>
-      </w:r>
-      <w:r>
-        <w:t>capable of processing</w:t>
-      </w:r>
-      <w:r>
-        <w:t xml:space="preserve"> financial documents</w:t>
-      </w:r>
-      <w:r>
-        <w:t>,</w:t>
-      </w:r>
-      <w:r>
-        <w:t xml:space="preserve"> </w:t>
-      </w:r>
-      <w:r>
-        <w:t>includ</w:t>
-      </w:r>
-      <w:r>
-        <w:t>ing</w:t>
-      </w:r>
-      <w:r>
-        <w:t xml:space="preserve"> but not restricted to</w:t>
-      </w:r>
-      <w:r>
-        <w:t xml:space="preserve"> </w:t>
-      </w:r>
-      <w:r>
-        <w:t>receipts, invoices, bank statements</w:t>
-      </w:r>
-      <w:r>
-        <w:t xml:space="preserve"> and travel documents</w:t>
-      </w:r>
-      <w:r>
-        <w:t>.</w:t>
-      </w:r>
-      <w:r>
-        <w:t xml:space="preserve"> </w:t>
-      </w:r>
-      <w:r>
-        <w:t>All, w</w:t>
-      </w:r>
-      <w:r>
-        <w:t xml:space="preserve">hilst </w:t>
-      </w:r>
-      <w:r>
-        <w:t>operating</w:t>
-      </w:r>
-      <w:r>
-        <w:t xml:space="preserve"> </w:t>
-      </w:r>
-      <w:r>
-        <w:t xml:space="preserve">with </w:t>
-      </w:r>
-      <w:r>
-        <w:t xml:space="preserve">a </w:t>
-      </w:r>
-      <w:r>
-        <w:t>production</w:t>
-      </w:r>
-      <w:r>
-        <w:t>-</w:t>
-      </w:r>
-      <w:r>
-        <w:t>level throughput</w:t>
-      </w:r>
-      <w:r>
-        <w:t xml:space="preserve"> on our self-managed GPU cluster</w:t>
-      </w:r>
-      <w:r>
-        <w:t>.</w:t>
-      </w:r>
-      <w:r>
-        <w:t xml:space="preserve"> </w:t>
-      </w:r>
-    </w:p>
-    <w:p>
-      <w:pPr>
-        <w:pStyle w:val="Heading2"/>
-      </w:pPr>
-      <w:bookmarkStart w:id="2" w:name="task"/>
-      <w:bookmarkEnd w:id="1"/>
-      <w:r>
-        <w:t>Task</w:t>
-      </w:r>
-    </w:p>
-    <w:p>
-      <w:pPr>
-        <w:pStyle w:val="FirstParagraph"/>
-      </w:pPr>
-      <w:r>
-        <w:t xml:space="preserve">The </w:t>
-      </w:r>
-      <w:r>
-        <w:t>P</w:t>
-      </w:r>
-      <w:r>
-        <w:t>L</w:t>
-      </w:r>
-      <w:r>
-        <w:t xml:space="preserve">191 </w:t>
-      </w:r>
-      <w:r>
-        <w:t>requirements</w:t>
-      </w:r>
-      <w:r>
-        <w:t xml:space="preserve">, </w:t>
-      </w:r>
-      <w:r>
-        <w:t>specif</w:t>
-      </w:r>
-      <w:r>
-        <w:t>y</w:t>
-      </w:r>
-      <w:r>
-        <w:t xml:space="preserve"> </w:t>
-      </w:r>
-      <w:r>
-        <w:rPr>
-          <w:b/>
-          <w:bCs/>
-        </w:rPr>
-        <w:t>three orthogonal dimensions</w:t>
-      </w:r>
-      <w:r>
-        <w:rPr>
-          <w:b/>
-          <w:bCs/>
-        </w:rPr>
-        <w:t>,</w:t>
-      </w:r>
-      <w:r>
-        <w:t xml:space="preserve"> </w:t>
-      </w:r>
-      <w:r>
-        <w:t>greatly complicating the</w:t>
-      </w:r>
-      <w:r>
-        <w:t xml:space="preserve"> code</w:t>
-      </w:r>
-      <w:r>
-        <w:t xml:space="preserve"> design</w:t>
-      </w:r>
-      <w:r>
-        <w:t xml:space="preserve">. </w:t>
-      </w:r>
-    </w:p>
-    <w:p>
-      <w:pPr>
-        <w:pStyle w:val="FirstParagraph"/>
-      </w:pPr>
-      <w:r>
-        <w:t xml:space="preserve">Dimension 1. Document classes were expected to grow, each with different layouts, field schemas, and extraction complexity. </w:t>
-      </w:r>
-    </w:p>
-    <w:p>
-      <w:pPr>
-        <w:pStyle w:val="FirstParagraph"/>
-      </w:pPr>
-      <w:r>
-        <w:t xml:space="preserve">Dimension 2. The </w:t>
-      </w:r>
-      <w:r>
-        <w:t xml:space="preserve">available </w:t>
-      </w:r>
-      <w:r>
-        <w:t xml:space="preserve">open-weight VLM landscape </w:t>
-      </w:r>
-      <w:r>
-        <w:t>is</w:t>
-      </w:r>
-      <w:r>
-        <w:t xml:space="preserve"> </w:t>
-      </w:r>
-      <w:r>
-        <w:t>evolving rapidly, with each new model</w:t>
-      </w:r>
-      <w:r>
-        <w:t xml:space="preserve"> </w:t>
-      </w:r>
-      <w:proofErr w:type="gramStart"/>
-      <w:r>
-        <w:t xml:space="preserve">possibly </w:t>
-      </w:r>
-      <w:r>
-        <w:t xml:space="preserve"> requiring</w:t>
-      </w:r>
-      <w:proofErr w:type="gramEnd"/>
-      <w:r>
-        <w:t xml:space="preserve"> different loading, quantization, and generation handling. </w:t>
-      </w:r>
-    </w:p>
-    <w:p>
-      <w:pPr>
-        <w:pStyle w:val="FirstParagraph"/>
-      </w:pPr>
-      <w:r>
-        <w:t>Dimension 3. Realistic</w:t>
-      </w:r>
-      <w:r>
-        <w:t xml:space="preserve"> </w:t>
-      </w:r>
-      <w:r>
-        <w:t xml:space="preserve">production </w:t>
-      </w:r>
-      <w:r>
-        <w:t>workloads</w:t>
-      </w:r>
-      <w:r>
-        <w:t xml:space="preserve"> </w:t>
-      </w:r>
-      <w:r>
-        <w:t>need</w:t>
-      </w:r>
-      <w:r>
-        <w:t xml:space="preserve"> </w:t>
-      </w:r>
-      <w:r>
-        <w:t xml:space="preserve">higher </w:t>
-      </w:r>
-      <w:r>
-        <w:t>throughput</w:t>
-      </w:r>
-      <w:r>
-        <w:t xml:space="preserve">s </w:t>
-      </w:r>
-      <w:r>
-        <w:t>than</w:t>
-      </w:r>
-      <w:r>
-        <w:t xml:space="preserve"> </w:t>
-      </w:r>
-      <w:r>
-        <w:t>our GPU cluster</w:t>
-      </w:r>
-      <w:r>
-        <w:t xml:space="preserve"> </w:t>
-      </w:r>
-      <w:r>
-        <w:t>HF</w:t>
-      </w:r>
-      <w:r>
-        <w:t xml:space="preserve"> </w:t>
-      </w:r>
-      <w:r>
-        <w:t>inference serving can provide</w:t>
-      </w:r>
-      <w:r>
-        <w:t xml:space="preserve">. </w:t>
-      </w:r>
-    </w:p>
-    <w:p>
-      <w:pPr>
-        <w:pStyle w:val="Heading2"/>
-      </w:pPr>
-      <w:bookmarkStart w:id="3" w:name="action"/>
-      <w:bookmarkEnd w:id="2"/>
-      <w:r>
-        <w:t>Action</w:t>
-      </w:r>
-    </w:p>
-    <w:p>
-      <w:pPr>
-        <w:pStyle w:val="FirstParagraph"/>
-      </w:pPr>
-      <w:r>
-        <w:t xml:space="preserve">A static pipeline cannot handle </w:t>
-      </w:r>
-      <w:r>
-        <w:t xml:space="preserve">the diverse </w:t>
-      </w:r>
-      <w:r>
-        <w:t>document processing</w:t>
-      </w:r>
-      <w:r>
-        <w:t xml:space="preserve"> requirements</w:t>
-      </w:r>
-      <w:r>
-        <w:t xml:space="preserve"> of our production </w:t>
-      </w:r>
-      <w:proofErr w:type="gramStart"/>
-      <w:r>
-        <w:t>workloads</w:t>
-      </w:r>
-      <w:proofErr w:type="gramEnd"/>
-      <w:r>
-        <w:t xml:space="preserve"> so we needed an Agentic Information Extraction pattern. This is because, we do not know the document type until we have looked at it, so the task </w:t>
-      </w:r>
-      <w:r>
-        <w:t xml:space="preserve">maps </w:t>
-      </w:r>
-      <w:r>
-        <w:t>naturally to</w:t>
-      </w:r>
-      <w:r>
-        <w:t xml:space="preserve"> the</w:t>
-      </w:r>
-      <w:r>
-        <w:t xml:space="preserve"> </w:t>
-      </w:r>
-      <w:r>
-        <w:rPr>
-          <w:b/>
-          <w:bCs/>
-        </w:rPr>
-        <w:t>Look-Ask-Act</w:t>
-      </w:r>
-      <w:r>
-        <w:rPr>
-          <w:b/>
-          <w:bCs/>
-        </w:rPr>
-        <w:t xml:space="preserve"> agentic pattern</w:t>
-      </w:r>
-      <w:r>
-        <w:t xml:space="preserve">, i.e. </w:t>
-      </w:r>
-    </w:p>
-    <w:p>
-      <w:pPr>
-        <w:pStyle w:val="FirstParagraph"/>
-        <w:numPr>
-          <w:ilvl w:val="0"/>
-          <w:numId w:val="2"/>
-        </w:numPr>
-      </w:pPr>
-      <w:r>
-        <w:rPr>
-          <w:i/>
-          <w:iCs/>
-        </w:rPr>
-        <w:t xml:space="preserve">perceive by classifying, </w:t>
-      </w:r>
-    </w:p>
-    <w:p>
-      <w:pPr>
-        <w:pStyle w:val="FirstParagraph"/>
-        <w:numPr>
-          <w:ilvl w:val="0"/>
-          <w:numId w:val="2"/>
-        </w:numPr>
-      </w:pPr>
-      <w:r>
-        <w:rPr>
-          <w:i/>
-          <w:iCs/>
-        </w:rPr>
-        <w:t xml:space="preserve">reason by selecting an extraction strategy, </w:t>
-      </w:r>
-    </w:p>
-    <w:p>
-      <w:pPr>
-        <w:pStyle w:val="FirstParagraph"/>
-        <w:numPr>
-          <w:ilvl w:val="0"/>
-          <w:numId w:val="2"/>
-        </w:numPr>
-      </w:pPr>
-      <w:r>
-        <w:rPr>
-          <w:i/>
-          <w:iCs/>
-        </w:rPr>
-        <w:t xml:space="preserve">then act by extracting </w:t>
-      </w:r>
-      <w:r>
-        <w:rPr>
-          <w:i/>
-          <w:iCs/>
-        </w:rPr>
-        <w:t xml:space="preserve">the </w:t>
-      </w:r>
-      <w:r>
-        <w:rPr>
-          <w:i/>
-          <w:iCs/>
-        </w:rPr>
-        <w:t>structured fields</w:t>
-      </w:r>
-      <w:r>
-        <w:t xml:space="preserve">. </w:t>
-      </w:r>
-    </w:p>
-    <w:p>
-      <w:pPr>
-        <w:pStyle w:val="FirstParagraph"/>
-      </w:pPr>
-      <w:r>
-        <w:t>Parse failures trigger a bounded self-correction cycle</w:t>
-      </w:r>
-      <w:r>
-        <w:t>.</w:t>
-      </w:r>
-      <w:r>
-        <w:t xml:space="preserve"> </w:t>
-      </w:r>
-      <w:r>
-        <w:t>B</w:t>
-      </w:r>
-      <w:r>
-        <w:t xml:space="preserve">ank </w:t>
-      </w:r>
-      <w:r>
-        <w:t>S</w:t>
-      </w:r>
-      <w:r>
-        <w:t>tatement</w:t>
-      </w:r>
-      <w:r>
-        <w:t xml:space="preserve"> </w:t>
-      </w:r>
-      <w:r>
-        <w:t xml:space="preserve">Information Extraction </w:t>
-      </w:r>
-      <w:r>
-        <w:t xml:space="preserve">and </w:t>
-      </w:r>
-      <w:r>
-        <w:t>T</w:t>
-      </w:r>
-      <w:r>
-        <w:t xml:space="preserve">ransaction </w:t>
-      </w:r>
-      <w:r>
-        <w:t>L</w:t>
-      </w:r>
-      <w:r>
-        <w:t>inking applications</w:t>
-      </w:r>
-      <w:r>
-        <w:t xml:space="preserve"> </w:t>
-      </w:r>
-      <w:r>
-        <w:t xml:space="preserve">must </w:t>
-      </w:r>
-      <w:r>
-        <w:t>maintain running state across multi-turn prompts</w:t>
-      </w:r>
-      <w:r>
-        <w:t>, with outputs of earlier turn</w:t>
-      </w:r>
-      <w:r>
-        <w:t>s</w:t>
-      </w:r>
-      <w:r>
-        <w:t xml:space="preserve"> injected dynamically into the next turn’s prompt</w:t>
-      </w:r>
-      <w:r>
-        <w:t>,</w:t>
-      </w:r>
-      <w:r>
-        <w:t xml:space="preserve"> </w:t>
-      </w:r>
-      <w:r>
-        <w:t xml:space="preserve">thereby </w:t>
-      </w:r>
-      <w:r>
-        <w:t xml:space="preserve">adding domain knowledge to </w:t>
-      </w:r>
-      <w:r>
-        <w:t xml:space="preserve">augment the </w:t>
-      </w:r>
-      <w:r>
-        <w:t xml:space="preserve">limited </w:t>
-      </w:r>
-      <w:r>
-        <w:t xml:space="preserve">reasoning </w:t>
-      </w:r>
-      <w:r>
-        <w:t xml:space="preserve">capacity </w:t>
-      </w:r>
-      <w:r>
-        <w:t>of our 8B parameter</w:t>
-      </w:r>
-      <w:r>
-        <w:t xml:space="preserve"> VLM.</w:t>
-      </w:r>
-    </w:p>
-    <w:p>
-      <w:pPr>
-        <w:pStyle w:val="BodyText"/>
-      </w:pPr>
-      <w:r>
-        <w:lastRenderedPageBreak/>
-        <w:t>To implement this</w:t>
-      </w:r>
-      <w:r>
-        <w:t xml:space="preserve"> agentic pattern</w:t>
-      </w:r>
-      <w:r>
-        <w:t xml:space="preserve">, we defined the workflow as a directed graph in YAML. Nodes are VLM inference calls and edges are routing conditions. Each node is a complete Look-Ask-Act cycle, and retry cycles are bounded by </w:t>
-      </w:r>
-      <w:r>
-        <w:t xml:space="preserve">YAML </w:t>
-      </w:r>
-      <w:r>
-        <w:t>configuration</w:t>
-      </w:r>
-      <w:r>
-        <w:t xml:space="preserve"> settings</w:t>
-      </w:r>
-      <w:r>
-        <w:t xml:space="preserve"> to prevent runaway loops under production load</w:t>
-      </w:r>
-      <w:r>
-        <w:t>s</w:t>
-      </w:r>
-      <w:r>
-        <w:t>.</w:t>
-      </w:r>
-    </w:p>
-    <w:p>
-      <w:pPr>
-        <w:pStyle w:val="BodyText"/>
-      </w:pPr>
-      <w:r>
-        <w:t xml:space="preserve">To improve maintainability, we applied a consistent </w:t>
-      </w:r>
-      <w:r>
-        <w:t xml:space="preserve">modular </w:t>
-      </w:r>
-      <w:r>
-        <w:t>design philosophy</w:t>
-      </w:r>
-      <w:r>
-        <w:t>.</w:t>
-      </w:r>
-      <w:r>
-        <w:t xml:space="preserve"> Model loading requirements, document field definitions, extraction prompts, and workflow topolog</w:t>
-      </w:r>
-      <w:r>
-        <w:t>ies</w:t>
-      </w:r>
-      <w:r>
-        <w:t xml:space="preserve">, </w:t>
-      </w:r>
-      <w:r>
-        <w:t xml:space="preserve">are all declared in YAML. The execution engine reads its instructions from </w:t>
-      </w:r>
-      <w:r>
-        <w:t xml:space="preserve">this </w:t>
-      </w:r>
-      <w:r>
-        <w:t>configuration</w:t>
-      </w:r>
-      <w:r>
-        <w:t xml:space="preserve"> file</w:t>
-      </w:r>
-      <w:r>
-        <w:t xml:space="preserve">; it does not contain them. </w:t>
-      </w:r>
-      <w:r>
-        <w:t xml:space="preserve">For example, </w:t>
-      </w:r>
-      <w:proofErr w:type="gramStart"/>
-      <w:r>
-        <w:t>Adding</w:t>
-      </w:r>
-      <w:proofErr w:type="gramEnd"/>
-      <w:r>
-        <w:t xml:space="preserve"> a new model requires one registration entry. Adding a new document class requires a field definition and a prompt, with no pipeline code changes in either case.</w:t>
-      </w:r>
-    </w:p>
-    <w:p>
-      <w:pPr>
-        <w:pStyle w:val="BodyText"/>
-      </w:pPr>
-      <w:r>
-        <w:t xml:space="preserve">To address throughput, we introduced a </w:t>
-      </w:r>
-      <w:r>
-        <w:t>new</w:t>
-      </w:r>
-      <w:r>
-        <w:t xml:space="preserve"> inference backend, </w:t>
-      </w:r>
-      <w:r>
-        <w:t xml:space="preserve">the </w:t>
-      </w:r>
-      <w:proofErr w:type="spellStart"/>
-      <w:r>
-        <w:t>vLLM</w:t>
-      </w:r>
-      <w:proofErr w:type="spellEnd"/>
-      <w:r>
-        <w:t xml:space="preserve"> (UC Be</w:t>
-      </w:r>
-      <w:r>
-        <w:t>r</w:t>
-      </w:r>
-      <w:r>
-        <w:t>kley 2023)</w:t>
-      </w:r>
-      <w:r>
-        <w:t xml:space="preserve">, </w:t>
-      </w:r>
-      <w:r>
-        <w:t>that uses</w:t>
-      </w:r>
-      <w:r>
-        <w:t xml:space="preserve"> </w:t>
-      </w:r>
-      <w:r>
-        <w:t xml:space="preserve">Prefix Caching, </w:t>
-      </w:r>
-      <w:r>
-        <w:t>Continuous Batching and Paged</w:t>
-      </w:r>
-      <w:r>
-        <w:t>-</w:t>
-      </w:r>
-      <w:r>
-        <w:t xml:space="preserve">Attention </w:t>
-      </w:r>
-      <w:r>
-        <w:t xml:space="preserve">distributed </w:t>
-      </w:r>
-      <w:r>
-        <w:t xml:space="preserve">across data-parallel GPU workers. </w:t>
-      </w:r>
-      <w:r>
-        <w:t>This reconfiguration obviated the low memory bandwidth constraint of the available GPU cluster</w:t>
-      </w:r>
-      <w:r>
-        <w:t>,</w:t>
-      </w:r>
-      <w:r>
-        <w:t xml:space="preserve"> raisin</w:t>
-      </w:r>
-      <w:r>
-        <w:t>g</w:t>
-      </w:r>
-      <w:r>
-        <w:t xml:space="preserve"> </w:t>
-      </w:r>
-      <w:r>
-        <w:t xml:space="preserve">KFP-Discovery </w:t>
-      </w:r>
-      <w:r>
-        <w:t>throughput from the original 2.6 images/min</w:t>
-      </w:r>
-      <w:r>
-        <w:t xml:space="preserve"> in late 2025</w:t>
-      </w:r>
-      <w:r>
-        <w:t xml:space="preserve"> up to 11.5 images/min</w:t>
-      </w:r>
-      <w:r>
-        <w:t>.</w:t>
-      </w:r>
-    </w:p>
-    <w:p>
-      <w:pPr>
-        <w:pStyle w:val="Heading2"/>
-      </w:pPr>
-      <w:bookmarkStart w:id="4" w:name="result"/>
-      <w:bookmarkEnd w:id="3"/>
-      <w:r>
-        <w:t>Result</w:t>
-      </w:r>
-    </w:p>
-    <w:p>
-      <w:pPr>
-        <w:pStyle w:val="BodyText"/>
-      </w:pPr>
-      <w:r>
-        <w:t xml:space="preserve">In terms of </w:t>
-      </w:r>
-      <w:r>
-        <w:rPr>
-          <w:i/>
-          <w:iCs/>
-        </w:rPr>
-        <w:t>agility</w:t>
-      </w:r>
-      <w:r>
-        <w:t xml:space="preserve">, each addition, whether a new model, a new document class, or a new inference backend, </w:t>
-      </w:r>
-      <w:r>
-        <w:t xml:space="preserve">is </w:t>
-      </w:r>
-      <w:r>
-        <w:rPr>
-          <w:b/>
-          <w:bCs/>
-        </w:rPr>
-        <w:t>additive</w:t>
-      </w:r>
-      <w:r>
-        <w:t xml:space="preserve"> </w:t>
-      </w:r>
-      <w:r>
-        <w:t>via</w:t>
-      </w:r>
-      <w:r>
-        <w:t xml:space="preserve"> </w:t>
-      </w:r>
-      <w:r>
-        <w:t>YAML</w:t>
-      </w:r>
-      <w:r>
-        <w:t xml:space="preserve"> configuration</w:t>
-      </w:r>
-      <w:r>
-        <w:t xml:space="preserve"> file </w:t>
-      </w:r>
-      <w:r>
-        <w:t xml:space="preserve">change </w:t>
-      </w:r>
-      <w:r>
-        <w:t>only</w:t>
-      </w:r>
-      <w:r>
-        <w:t>.</w:t>
-      </w:r>
-    </w:p>
-    <w:p>
-      <w:pPr>
-        <w:pStyle w:val="BodyText"/>
-      </w:pPr>
-      <w:r>
-        <w:t>And in terms of maintenance</w:t>
-      </w:r>
-      <w:r>
-        <w:t xml:space="preserve">: </w:t>
-      </w:r>
-    </w:p>
-    <w:p>
-      <w:pPr>
-        <w:pStyle w:val="BodyText"/>
-        <w:numPr>
-          <w:ilvl w:val="0"/>
-          <w:numId w:val="4"/>
-        </w:numPr>
-      </w:pPr>
-      <w:r>
-        <w:t>the modular desig</w:t>
-      </w:r>
-      <w:r>
-        <w:t>n reduces</w:t>
-      </w:r>
-      <w:r>
-        <w:rPr>
-          <w:i/>
-          <w:iCs/>
+          <w:rFonts w:asciiTheme="minorHAnsi" w:eastAsiaTheme="minorEastAsia" w:hAnsiTheme="minorHAnsi" w:cstheme="minorBidi"/>
+          <w:color w:val="auto"/>
+          <w:sz w:val="24"/>
+          <w:szCs w:val="24"/>
         </w:rPr>
         <w:t xml:space="preserve"> </w:t>
       </w:r>
       <w:r>
         <w:rPr>
-          <w:i/>
-          <w:iCs/>
+          <w:rFonts w:asciiTheme="minorHAnsi" w:eastAsiaTheme="minorEastAsia" w:hAnsiTheme="minorHAnsi" w:cstheme="minorBidi"/>
+          <w:color w:val="auto"/>
+          <w:sz w:val="24"/>
+          <w:szCs w:val="24"/>
         </w:rPr>
-        <w:t>cognitive complexity</w:t>
-      </w:r>
-      <w:r>
+        <w:t>and extraction complexity.</w:t>
+      </w:r>
+    </w:p>
+    <w:p>
+      <w:pPr>
+        <w:pStyle w:val="Heading2"/>
         <w:rPr>
-          <w:i/>
-          <w:iCs/>
+          <w:rFonts w:asciiTheme="minorHAnsi" w:eastAsiaTheme="minorEastAsia" w:hAnsiTheme="minorHAnsi" w:cstheme="minorBidi"/>
+          <w:color w:val="auto"/>
+          <w:sz w:val="24"/>
+          <w:szCs w:val="24"/>
+        </w:rPr>
+      </w:pPr>
+      <w:r>
+        <w:rPr>
+          <w:rFonts w:asciiTheme="minorHAnsi" w:eastAsiaTheme="minorEastAsia" w:hAnsiTheme="minorHAnsi" w:cstheme="minorBidi"/>
+          <w:color w:val="auto"/>
+          <w:sz w:val="24"/>
+          <w:szCs w:val="24"/>
+        </w:rPr>
+        <w:t xml:space="preserve">  2. Model churn — the open-weight VLM landscape evolves rapidly, and each model requires different loading, quantization, and generation code.</w:t>
+      </w:r>
+    </w:p>
+    <w:p>
+      <w:pPr>
+        <w:pStyle w:val="Heading2"/>
+        <w:rPr>
+          <w:rFonts w:asciiTheme="minorHAnsi" w:eastAsiaTheme="minorEastAsia" w:hAnsiTheme="minorHAnsi" w:cstheme="minorBidi"/>
+          <w:color w:val="auto"/>
+          <w:sz w:val="24"/>
+          <w:szCs w:val="24"/>
+        </w:rPr>
+      </w:pPr>
+      <w:r>
+        <w:rPr>
+          <w:rFonts w:asciiTheme="minorHAnsi" w:eastAsiaTheme="minorEastAsia" w:hAnsiTheme="minorHAnsi" w:cstheme="minorBidi"/>
+          <w:color w:val="auto"/>
+          <w:sz w:val="24"/>
+          <w:szCs w:val="24"/>
+        </w:rPr>
+        <w:t xml:space="preserve">  3. Throughput — production workloads demand higher throughput than </w:t>
+      </w:r>
+      <w:proofErr w:type="spellStart"/>
+      <w:r>
+        <w:rPr>
+          <w:rFonts w:asciiTheme="minorHAnsi" w:eastAsiaTheme="minorEastAsia" w:hAnsiTheme="minorHAnsi" w:cstheme="minorBidi"/>
+          <w:color w:val="auto"/>
+          <w:sz w:val="24"/>
+          <w:szCs w:val="24"/>
+        </w:rPr>
+        <w:t>HuggingFace</w:t>
+      </w:r>
+      <w:proofErr w:type="spellEnd"/>
+      <w:r>
+        <w:rPr>
+          <w:rFonts w:asciiTheme="minorHAnsi" w:eastAsiaTheme="minorEastAsia" w:hAnsiTheme="minorHAnsi" w:cstheme="minorBidi"/>
+          <w:color w:val="auto"/>
+          <w:sz w:val="24"/>
+          <w:szCs w:val="24"/>
+        </w:rPr>
+        <w:t xml:space="preserve"> inference can deliver on our GPU</w:t>
+      </w:r>
+      <w:r>
+        <w:rPr>
+          <w:rFonts w:asciiTheme="minorHAnsi" w:eastAsiaTheme="minorEastAsia" w:hAnsiTheme="minorHAnsi" w:cstheme="minorBidi"/>
+          <w:color w:val="auto"/>
+          <w:sz w:val="24"/>
+          <w:szCs w:val="24"/>
         </w:rPr>
         <w:t xml:space="preserve"> </w:t>
       </w:r>
+      <w:r>
+        <w:rPr>
+          <w:rFonts w:asciiTheme="minorHAnsi" w:eastAsiaTheme="minorEastAsia" w:hAnsiTheme="minorHAnsi" w:cstheme="minorBidi"/>
+          <w:color w:val="auto"/>
+          <w:sz w:val="24"/>
+          <w:szCs w:val="24"/>
+        </w:rPr>
+        <w:t>cluster.</w:t>
+      </w:r>
+    </w:p>
+    <w:p>
+      <w:pPr>
+        <w:pStyle w:val="Heading2"/>
+        <w:rPr>
+          <w:rFonts w:asciiTheme="minorHAnsi" w:eastAsiaTheme="minorEastAsia" w:hAnsiTheme="minorHAnsi" w:cstheme="minorBidi"/>
+          <w:color w:val="auto"/>
+          <w:sz w:val="24"/>
+          <w:szCs w:val="24"/>
+        </w:rPr>
+      </w:pPr>
+      <w:r>
+        <w:rPr>
+          <w:rFonts w:asciiTheme="minorHAnsi" w:eastAsiaTheme="minorEastAsia" w:hAnsiTheme="minorHAnsi" w:cstheme="minorBidi"/>
+          <w:color w:val="auto"/>
+          <w:sz w:val="24"/>
+          <w:szCs w:val="24"/>
+        </w:rPr>
+        <w:t>The pipeline had to be extensible across all three without coupling them together.</w:t>
+      </w:r>
+    </w:p>
+    <w:p>
+      <w:pPr>
+        <w:pStyle w:val="Heading2"/>
+      </w:pPr>
+      <w:r>
+        <w:t>Action</w:t>
+      </w:r>
+    </w:p>
+    <w:p>
+      <w:pPr>
+        <w:pStyle w:val="FirstParagraph"/>
+      </w:pPr>
+      <w:r>
+        <w:t>Document type is unknown until the model sees the image, so extraction is driven by a state-machine graph: the VLM first classifies the document, then a router selects the type-specific extraction path. Each node's output is accumulated in shared state, with parse failures triggering a bounded self-correction loop. For bank statements — single-page but information-dense — the graph sequences multiple extraction turns, injecting each turn's output into the next turn's prompt so the model can work through the document progressively.</w:t>
+      </w:r>
+    </w:p>
+    <w:p>
+      <w:pPr>
+        <w:pStyle w:val="BodyText"/>
+      </w:pPr>
+      <w:r>
+        <w:t xml:space="preserve">Parse failures trigger a bounded retry loop — the model receives its error and tries again, up to a configurable  limit.                                                                                                           </w:t>
+      </w:r>
+    </w:p>
+    <w:p>
+      <w:pPr>
+        <w:pStyle w:val="BodyText"/>
+      </w:pPr>
+      <w:r>
+        <w:t xml:space="preserve">For bank statements — single-page but information-dense — extraction runs across multiple turns. Each </w:t>
+      </w:r>
       <w:proofErr w:type="gramStart"/>
       <w:r>
-        <w:t>of  the</w:t>
+        <w:t>turn's  output</w:t>
       </w:r>
       <w:proofErr w:type="gramEnd"/>
       <w:r>
-        <w:t xml:space="preserve"> maintainer’s mental model</w:t>
-      </w:r>
-      <w:r>
-        <w:rPr>
-          <w:i/>
-          <w:iCs/>
-        </w:rPr>
+        <w:t xml:space="preserve"> is injected into the next turn's prompt, giving the model the context it needs to work through the document progressively.</w:t>
+      </w:r>
+    </w:p>
+    <w:p>
+      <w:pPr>
+        <w:pStyle w:val="BodyText"/>
+      </w:pPr>
+      <w:r>
+        <w:lastRenderedPageBreak/>
+        <w:t>The workflow is defined as a directed graph in YAML. Nodes are VLM calls or routing decisions; edges are conditional transitions. Retry limits are declared in the same YAML, preventing runaway loops under production load.</w:t>
+      </w:r>
+    </w:p>
+    <w:p>
+      <w:pPr>
+        <w:pStyle w:val="BodyText"/>
+      </w:pPr>
+      <w:r>
+        <w:t>We applied this declarative approach consistently: model registrations, document field schemas, extraction prompts, and workflow topologies are all configuration, not code. The execution engine reads its instructions — it doesn't contain them. Adding a new model requires one registry entry. Adding a new document type requires a field definition and a prompt. Neither requires pipeline code changes.</w:t>
+      </w:r>
+    </w:p>
+    <w:p>
+      <w:pPr>
+        <w:pStyle w:val="BodyText"/>
+      </w:pPr>
+      <w:r>
+        <w:t xml:space="preserve">To address throughput, we introduced a </w:t>
+      </w:r>
+      <w:r>
+        <w:t>new</w:t>
+      </w:r>
+      <w:r>
+        <w:t xml:space="preserve"> inference backend, </w:t>
+      </w:r>
+      <w:r>
+        <w:t xml:space="preserve">the </w:t>
+      </w:r>
+      <w:proofErr w:type="spellStart"/>
+      <w:r>
+        <w:t>vLLM</w:t>
+      </w:r>
+      <w:proofErr w:type="spellEnd"/>
+      <w:r>
+        <w:t xml:space="preserve"> (UC Be</w:t>
+      </w:r>
+      <w:r>
+        <w:t>r</w:t>
+      </w:r>
+      <w:r>
+        <w:t>kley 2023)</w:t>
+      </w:r>
+      <w:r>
+        <w:t xml:space="preserve">, </w:t>
+      </w:r>
+      <w:r>
+        <w:t>that uses</w:t>
+      </w:r>
+      <w:r>
+        <w:t xml:space="preserve"> </w:t>
+      </w:r>
+      <w:r>
+        <w:t xml:space="preserve">Prefix Caching, </w:t>
+      </w:r>
+      <w:r>
+        <w:t>Continuous Batching and Paged</w:t>
+      </w:r>
+      <w:r>
+        <w:t>-</w:t>
+      </w:r>
+      <w:r>
+        <w:t xml:space="preserve">Attention </w:t>
+      </w:r>
+      <w:r>
+        <w:t xml:space="preserve">distributed </w:t>
+      </w:r>
+      <w:r>
+        <w:t xml:space="preserve">across data-parallel GPU workers. </w:t>
+      </w:r>
+      <w:r>
+        <w:t>This reconfiguration obviated the low memory bandwidth constraint of the available GPU cluster</w:t>
+      </w:r>
+      <w:r>
         <w:t>,</w:t>
       </w:r>
       <w:r>
-        <w:t xml:space="preserve"> because each concern has exactly one location in the code base, so the system is navigable because its boundaries are clear </w:t>
-      </w:r>
-    </w:p>
-    <w:p>
-      <w:pPr>
-        <w:pStyle w:val="BodyText"/>
-        <w:numPr>
-          <w:ilvl w:val="0"/>
-          <w:numId w:val="4"/>
-        </w:numPr>
-      </w:pPr>
-      <w:r>
-        <w:t>modules only interact via</w:t>
-      </w:r>
-      <w:r>
-        <w:t xml:space="preserve"> clear </w:t>
-      </w:r>
-      <w:r>
-        <w:t xml:space="preserve">and narrow </w:t>
-      </w:r>
-      <w:r>
-        <w:t xml:space="preserve">interfaces, </w:t>
-      </w:r>
-      <w:r>
-        <w:t>failures are</w:t>
-      </w:r>
-      <w:r>
-        <w:t xml:space="preserve"> then</w:t>
+        <w:t xml:space="preserve"> raisin</w:t>
+      </w:r>
+      <w:r>
+        <w:t>g</w:t>
       </w:r>
       <w:r>
         <w:t xml:space="preserve"> </w:t>
       </w:r>
+      <w:r>
+        <w:t xml:space="preserve">KFP-Discovery </w:t>
+      </w:r>
+      <w:r>
+        <w:t>throughput from the original 2.6 images/min</w:t>
+      </w:r>
+      <w:r>
+        <w:t xml:space="preserve"> in late 2025</w:t>
+      </w:r>
+      <w:r>
+        <w:t xml:space="preserve"> up to 11.5 images/min</w:t>
+      </w:r>
+      <w:r>
+        <w:t>.</w:t>
+      </w:r>
+    </w:p>
+    <w:p>
+      <w:pPr>
+        <w:pStyle w:val="Heading2"/>
+      </w:pPr>
+      <w:bookmarkStart w:id="3" w:name="result"/>
+      <w:bookmarkEnd w:id="2"/>
+      <w:r>
+        <w:t>Result</w:t>
+      </w:r>
+    </w:p>
+    <w:bookmarkEnd w:id="0"/>
+    <w:bookmarkEnd w:id="3"/>
+    <w:p>
+      <w:pPr>
+        <w:pStyle w:val="FirstParagraph"/>
+      </w:pPr>
+      <w:r>
+        <w:t xml:space="preserve">Extensibility: adding a new model, document class, or inference backend requires only a YAML </w:t>
+      </w:r>
+      <w:proofErr w:type="gramStart"/>
+      <w:r>
+        <w:t>configuration  change</w:t>
+      </w:r>
+      <w:proofErr w:type="gramEnd"/>
+      <w:r>
+        <w:t xml:space="preserve"> — no pipeline code modifications.                                                                    </w:t>
+      </w:r>
+    </w:p>
+    <w:p>
+      <w:pPr>
+        <w:pStyle w:val="FirstParagraph"/>
+      </w:pPr>
+      <w:r>
+        <w:t xml:space="preserve">Maintainability:                                                                                            </w:t>
+      </w:r>
+    </w:p>
+    <w:p>
+      <w:pPr>
+        <w:pStyle w:val="FirstParagraph"/>
+      </w:pPr>
+      <w:r>
+        <w:t xml:space="preserve">- Each concern lives in exactly one place, so the codebase is navigable and failures stay </w:t>
+      </w:r>
       <w:proofErr w:type="spellStart"/>
       <w:r>
         <w:t>localised</w:t>
       </w:r>
       <w:proofErr w:type="spellEnd"/>
       <w:r>
-        <w:t xml:space="preserve">, so changes do not propagate unexpectedly. </w:t>
-      </w:r>
-    </w:p>
-    <w:p>
-      <w:pPr>
-        <w:pStyle w:val="BodyText"/>
-        <w:numPr>
-          <w:ilvl w:val="0"/>
-          <w:numId w:val="4"/>
-        </w:numPr>
-      </w:pPr>
-      <w:r>
-        <w:t xml:space="preserve">Declarative YAML specifications separate the </w:t>
-      </w:r>
-      <w:r>
-        <w:rPr>
-          <w:b/>
-          <w:bCs/>
-        </w:rPr>
-        <w:t>What</w:t>
-      </w:r>
-      <w:r>
-        <w:t xml:space="preserve"> f</w:t>
-      </w:r>
-      <w:r>
-        <w:t>ro</w:t>
-      </w:r>
-      <w:r>
-        <w:t xml:space="preserve">m the </w:t>
+        <w:t>.</w:t>
+      </w:r>
+    </w:p>
+    <w:p>
+      <w:pPr>
+        <w:pStyle w:val="FirstParagraph"/>
+      </w:pPr>
+      <w:r>
+        <w:t xml:space="preserve">  - Modules interact through narrow interfaces — changes don't propagate unexpectedly.</w:t>
+      </w:r>
+    </w:p>
+    <w:p>
+      <w:pPr>
+        <w:pStyle w:val="FirstParagraph"/>
+      </w:pPr>
+      <w:r>
+        <w:t xml:space="preserve">  - YAML declarations separate what to extract from how to extract </w:t>
       </w:r>
       <w:proofErr w:type="gramStart"/>
       <w:r>
-        <w:rPr>
-          <w:b/>
-          <w:bCs/>
-        </w:rPr>
-        <w:t>How</w:t>
-      </w:r>
-      <w:r>
-        <w:t>, and</w:t>
+        <w:t>it, and</w:t>
       </w:r>
       <w:proofErr w:type="gramEnd"/>
       <w:r>
-        <w:t xml:space="preserve"> serve as </w:t>
-      </w:r>
-      <w:r>
-        <w:t xml:space="preserve">the </w:t>
-      </w:r>
-      <w:r>
-        <w:t>living documentation</w:t>
-      </w:r>
-      <w:r>
-        <w:t xml:space="preserve"> for the system</w:t>
-      </w:r>
-      <w:r>
-        <w:t>.</w:t>
+        <w:t xml:space="preserve"> serve as living documentation.</w:t>
       </w:r>
     </w:p>
     <w:p>
@@ -1016,121 +436,40 @@
         <w:pStyle w:val="FirstParagraph"/>
       </w:pPr>
       <w:r>
-        <w:t xml:space="preserve">In summary, </w:t>
-      </w:r>
-      <w:r>
-        <w:t xml:space="preserve">the requirements of the Project’s PL191 </w:t>
-      </w:r>
-      <w:r>
-        <w:t xml:space="preserve">docs </w:t>
-      </w:r>
-      <w:r>
-        <w:t xml:space="preserve">have been </w:t>
-      </w:r>
-      <w:r>
-        <w:t>delivered</w:t>
-      </w:r>
-      <w:r>
-        <w:t>. That is,</w:t>
+        <w:t>Result: the PL191 requirements have been delivered —</w:t>
       </w:r>
     </w:p>
     <w:p>
       <w:pPr>
         <w:pStyle w:val="FirstParagraph"/>
-        <w:numPr>
-          <w:ilvl w:val="0"/>
-          <w:numId w:val="3"/>
-        </w:numPr>
-      </w:pPr>
-      <w:r>
-        <w:t>a self-</w:t>
-      </w:r>
-      <w:r>
-        <w:t>managed</w:t>
-      </w:r>
-      <w:r>
-        <w:t xml:space="preserve"> Information Extraction pipeline</w:t>
-      </w:r>
-      <w:r>
-        <w:t xml:space="preserve"> running on our locally </w:t>
-      </w:r>
-      <w:r>
-        <w:t>managed</w:t>
-      </w:r>
-      <w:r>
-        <w:t xml:space="preserve"> GPU clusters</w:t>
+      </w:pPr>
+      <w:r>
+        <w:t xml:space="preserve">  - a self-managed information extraction pipeline running on our local GPU cluster,</w:t>
       </w:r>
     </w:p>
     <w:p>
       <w:pPr>
         <w:pStyle w:val="FirstParagraph"/>
-        <w:numPr>
-          <w:ilvl w:val="0"/>
-          <w:numId w:val="3"/>
-        </w:numPr>
-      </w:pPr>
-      <w:r>
-        <w:t xml:space="preserve">that </w:t>
-      </w:r>
-      <w:r>
-        <w:t>support</w:t>
-      </w:r>
-      <w:r>
-        <w:t xml:space="preserve">s </w:t>
-      </w:r>
-      <w:r>
-        <w:t xml:space="preserve">multiple open-weight VLM variants, </w:t>
+      </w:pPr>
+      <w:r>
+        <w:t xml:space="preserve">  - supporting multiple open-weight VLMs,</w:t>
       </w:r>
     </w:p>
     <w:p>
       <w:pPr>
         <w:pStyle w:val="FirstParagraph"/>
-        <w:numPr>
-          <w:ilvl w:val="0"/>
-          <w:numId w:val="3"/>
-        </w:numPr>
-      </w:pPr>
-      <w:r>
-        <w:t xml:space="preserve">that can </w:t>
-      </w:r>
-      <w:r>
-        <w:t>process</w:t>
-      </w:r>
-      <w:r>
-        <w:t xml:space="preserve"> </w:t>
-      </w:r>
-      <w:r>
-        <w:t>multiple document classes</w:t>
-      </w:r>
-      <w:r>
-        <w:t xml:space="preserve"> with </w:t>
-      </w:r>
-      <w:r>
-        <w:t xml:space="preserve">a </w:t>
-      </w:r>
-      <w:r>
-        <w:t>production-level throughput</w:t>
-      </w:r>
-      <w:r>
-        <w:t xml:space="preserve">, </w:t>
+      </w:pPr>
+      <w:r>
+        <w:t xml:space="preserve">  - processing multiple document classes at production throughput,</w:t>
       </w:r>
     </w:p>
     <w:p>
       <w:pPr>
         <w:pStyle w:val="FirstParagraph"/>
-        <w:numPr>
-          <w:ilvl w:val="0"/>
-          <w:numId w:val="3"/>
-        </w:numPr>
-      </w:pPr>
-      <w:r>
-        <w:t xml:space="preserve">all without any external API </w:t>
-      </w:r>
-      <w:r>
-        <w:t>or framework dependency.</w:t>
-      </w:r>
-      <w:bookmarkEnd w:id="0"/>
-      <w:bookmarkEnd w:id="4"/>
+      </w:pPr>
+      <w:r>
+        <w:t xml:space="preserve">  - with no external API or framework dependencies.</w:t>
+      </w:r>
     </w:p>
     <w:sectPr>
       <w:footnotePr>
@@ -1869,7 +1208,6 @@
     <w:next w:val="BodyText"/>
     <w:link w:val="Heading2Char"/>
     <w:uiPriority w:val="9"/>
-    <w:semiHidden/>
     <w:unhideWhenUsed/>
     <w:qFormat/>
     <w:rsid w:val="00A10FD9"/>
@@ -2237,7 +1575,6 @@
     <w:basedOn w:val="DefaultParagraphFont"/>
     <w:link w:val="Heading2"/>
     <w:uiPriority w:val="9"/>
-    <w:semiHidden/>
     <w:rsid w:val="00A10FD9"/>
     <w:rPr>
       <w:rFonts w:asciiTheme="majorHAnsi" w:eastAsiaTheme="majorEastAsia" w:hAnsiTheme="majorHAnsi" w:cstheme="majorBidi"/>

</xml_diff>

<commit_message>
docs: revise MyStarExample STAR narrative
</commit_message>
<xml_diff>
--- a/MyStarExample.docx
+++ b/MyStarExample.docx
@@ -372,7 +372,14 @@
         <w:pStyle w:val="FirstParagraph"/>
       </w:pPr>
       <w:r>
-        <w:t xml:space="preserve">Extensibility: adding a new model, document class, or inference backend requires only a YAML </w:t>
+        <w:rPr>
+          <w:b/>
+          <w:bCs/>
+        </w:rPr>
+        <w:t>Extensibility</w:t>
+      </w:r>
+      <w:r>
+        <w:t xml:space="preserve">: adding a new model, document class, or inference backend requires only a YAML </w:t>
       </w:r>
       <w:proofErr w:type="gramStart"/>
       <w:r>
@@ -388,15 +395,26 @@
         <w:pStyle w:val="FirstParagraph"/>
       </w:pPr>
       <w:r>
-        <w:t xml:space="preserve">Maintainability:                                                                                            </w:t>
+        <w:rPr>
+          <w:b/>
+          <w:bCs/>
+        </w:rPr>
+        <w:t>Maintainability</w:t>
+      </w:r>
+      <w:r>
+        <w:t xml:space="preserve">:                                                                                            </w:t>
       </w:r>
     </w:p>
     <w:p>
       <w:pPr>
         <w:pStyle w:val="FirstParagraph"/>
-      </w:pPr>
-      <w:r>
-        <w:t xml:space="preserve">- Each concern lives in exactly one place, so the codebase is navigable and failures stay </w:t>
+        <w:numPr>
+          <w:ilvl w:val="0"/>
+          <w:numId w:val="6"/>
+        </w:numPr>
+      </w:pPr>
+      <w:r>
+        <w:t xml:space="preserve">Each concern lives in exactly one place, so the codebase is navigable and failures stay </w:t>
       </w:r>
       <w:proofErr w:type="spellStart"/>
       <w:r>
@@ -410,17 +428,25 @@
     <w:p>
       <w:pPr>
         <w:pStyle w:val="FirstParagraph"/>
-      </w:pPr>
-      <w:r>
-        <w:t xml:space="preserve">  - Modules interact through narrow interfaces — changes don't propagate unexpectedly.</w:t>
+        <w:numPr>
+          <w:ilvl w:val="0"/>
+          <w:numId w:val="6"/>
+        </w:numPr>
+      </w:pPr>
+      <w:r>
+        <w:t>Modules interact through narrow interfaces — changes don't propagate unexpectedly.</w:t>
       </w:r>
     </w:p>
     <w:p>
       <w:pPr>
         <w:pStyle w:val="FirstParagraph"/>
-      </w:pPr>
-      <w:r>
-        <w:t xml:space="preserve">  - YAML declarations separate what to extract from how to extract </w:t>
+        <w:numPr>
+          <w:ilvl w:val="0"/>
+          <w:numId w:val="6"/>
+        </w:numPr>
+      </w:pPr>
+      <w:r>
+        <w:t xml:space="preserve">YAML declarations separate what to extract from how to extract </w:t>
       </w:r>
       <w:proofErr w:type="gramStart"/>
       <w:r>
@@ -436,39 +462,62 @@
         <w:pStyle w:val="FirstParagraph"/>
       </w:pPr>
       <w:r>
-        <w:t>Result: the PL191 requirements have been delivered —</w:t>
+        <w:rPr>
+          <w:b/>
+          <w:bCs/>
+        </w:rPr>
+        <w:t>Result</w:t>
+      </w:r>
+      <w:r>
+        <w:t>: the PL191 requirements have been delivered —</w:t>
       </w:r>
     </w:p>
     <w:p>
       <w:pPr>
         <w:pStyle w:val="FirstParagraph"/>
-      </w:pPr>
-      <w:r>
-        <w:t xml:space="preserve">  - a self-managed information extraction pipeline running on our local GPU cluster,</w:t>
+        <w:numPr>
+          <w:ilvl w:val="0"/>
+          <w:numId w:val="6"/>
+        </w:numPr>
+      </w:pPr>
+      <w:r>
+        <w:t>a self-managed information extraction pipeline running on our local GPU cluster,</w:t>
       </w:r>
     </w:p>
     <w:p>
       <w:pPr>
         <w:pStyle w:val="FirstParagraph"/>
-      </w:pPr>
-      <w:r>
-        <w:t xml:space="preserve">  - supporting multiple open-weight VLMs,</w:t>
+        <w:numPr>
+          <w:ilvl w:val="0"/>
+          <w:numId w:val="6"/>
+        </w:numPr>
+      </w:pPr>
+      <w:r>
+        <w:t>supporting multiple open-weight VLMs,</w:t>
       </w:r>
     </w:p>
     <w:p>
       <w:pPr>
         <w:pStyle w:val="FirstParagraph"/>
-      </w:pPr>
-      <w:r>
-        <w:t xml:space="preserve">  - processing multiple document classes at production throughput,</w:t>
+        <w:numPr>
+          <w:ilvl w:val="0"/>
+          <w:numId w:val="6"/>
+        </w:numPr>
+      </w:pPr>
+      <w:r>
+        <w:t>processing multiple document classes at production throughput,</w:t>
       </w:r>
     </w:p>
     <w:p>
       <w:pPr>
         <w:pStyle w:val="FirstParagraph"/>
-      </w:pPr>
-      <w:r>
-        <w:t xml:space="preserve">  - with no external API or framework dependencies.</w:t>
+        <w:numPr>
+          <w:ilvl w:val="0"/>
+          <w:numId w:val="6"/>
+        </w:numPr>
+      </w:pPr>
+      <w:r>
+        <w:t>with no external API or framework dependencies.</w:t>
       </w:r>
     </w:p>
     <w:sectPr>
@@ -563,6 +612,118 @@
     </w:lvl>
   </w:abstractNum>
   <w:abstractNum w:abstractNumId="1" w15:restartNumberingAfterBreak="0">
+    <w:nsid w:val="04D03DBA"/>
+    <w:multiLevelType w:val="hybridMultilevel"/>
+    <w:tmpl w:val="962CB330"/>
+    <w:lvl w:ilvl="0" w:tplc="B6AA3EB0">
+      <w:numFmt w:val="bullet"/>
+      <w:lvlText w:val="-"/>
+      <w:lvlJc w:val="left"/>
+      <w:pPr>
+        <w:ind w:left="720" w:hanging="360"/>
+      </w:pPr>
+      <w:rPr>
+        <w:rFonts w:ascii="Aptos" w:eastAsiaTheme="minorEastAsia" w:hAnsi="Aptos" w:cstheme="minorBidi" w:hint="default"/>
+      </w:rPr>
+    </w:lvl>
+    <w:lvl w:ilvl="1" w:tplc="08090003" w:tentative="1">
+      <w:start w:val="1"/>
+      <w:numFmt w:val="bullet"/>
+      <w:lvlText w:val="o"/>
+      <w:lvlJc w:val="left"/>
+      <w:pPr>
+        <w:ind w:left="1440" w:hanging="360"/>
+      </w:pPr>
+      <w:rPr>
+        <w:rFonts w:ascii="Courier New" w:hAnsi="Courier New" w:cs="Courier New" w:hint="default"/>
+      </w:rPr>
+    </w:lvl>
+    <w:lvl w:ilvl="2" w:tplc="08090005" w:tentative="1">
+      <w:start w:val="1"/>
+      <w:numFmt w:val="bullet"/>
+      <w:lvlText w:val=""/>
+      <w:lvlJc w:val="left"/>
+      <w:pPr>
+        <w:ind w:left="2160" w:hanging="360"/>
+      </w:pPr>
+      <w:rPr>
+        <w:rFonts w:ascii="Wingdings" w:hAnsi="Wingdings" w:hint="default"/>
+      </w:rPr>
+    </w:lvl>
+    <w:lvl w:ilvl="3" w:tplc="08090001" w:tentative="1">
+      <w:start w:val="1"/>
+      <w:numFmt w:val="bullet"/>
+      <w:lvlText w:val=""/>
+      <w:lvlJc w:val="left"/>
+      <w:pPr>
+        <w:ind w:left="2880" w:hanging="360"/>
+      </w:pPr>
+      <w:rPr>
+        <w:rFonts w:ascii="Symbol" w:hAnsi="Symbol" w:hint="default"/>
+      </w:rPr>
+    </w:lvl>
+    <w:lvl w:ilvl="4" w:tplc="08090003" w:tentative="1">
+      <w:start w:val="1"/>
+      <w:numFmt w:val="bullet"/>
+      <w:lvlText w:val="o"/>
+      <w:lvlJc w:val="left"/>
+      <w:pPr>
+        <w:ind w:left="3600" w:hanging="360"/>
+      </w:pPr>
+      <w:rPr>
+        <w:rFonts w:ascii="Courier New" w:hAnsi="Courier New" w:cs="Courier New" w:hint="default"/>
+      </w:rPr>
+    </w:lvl>
+    <w:lvl w:ilvl="5" w:tplc="08090005" w:tentative="1">
+      <w:start w:val="1"/>
+      <w:numFmt w:val="bullet"/>
+      <w:lvlText w:val=""/>
+      <w:lvlJc w:val="left"/>
+      <w:pPr>
+        <w:ind w:left="4320" w:hanging="360"/>
+      </w:pPr>
+      <w:rPr>
+        <w:rFonts w:ascii="Wingdings" w:hAnsi="Wingdings" w:hint="default"/>
+      </w:rPr>
+    </w:lvl>
+    <w:lvl w:ilvl="6" w:tplc="08090001" w:tentative="1">
+      <w:start w:val="1"/>
+      <w:numFmt w:val="bullet"/>
+      <w:lvlText w:val=""/>
+      <w:lvlJc w:val="left"/>
+      <w:pPr>
+        <w:ind w:left="5040" w:hanging="360"/>
+      </w:pPr>
+      <w:rPr>
+        <w:rFonts w:ascii="Symbol" w:hAnsi="Symbol" w:hint="default"/>
+      </w:rPr>
+    </w:lvl>
+    <w:lvl w:ilvl="7" w:tplc="08090003" w:tentative="1">
+      <w:start w:val="1"/>
+      <w:numFmt w:val="bullet"/>
+      <w:lvlText w:val="o"/>
+      <w:lvlJc w:val="left"/>
+      <w:pPr>
+        <w:ind w:left="5760" w:hanging="360"/>
+      </w:pPr>
+      <w:rPr>
+        <w:rFonts w:ascii="Courier New" w:hAnsi="Courier New" w:cs="Courier New" w:hint="default"/>
+      </w:rPr>
+    </w:lvl>
+    <w:lvl w:ilvl="8" w:tplc="08090005" w:tentative="1">
+      <w:start w:val="1"/>
+      <w:numFmt w:val="bullet"/>
+      <w:lvlText w:val=""/>
+      <w:lvlJc w:val="left"/>
+      <w:pPr>
+        <w:ind w:left="6480" w:hanging="360"/>
+      </w:pPr>
+      <w:rPr>
+        <w:rFonts w:ascii="Wingdings" w:hAnsi="Wingdings" w:hint="default"/>
+      </w:rPr>
+    </w:lvl>
+  </w:abstractNum>
+  <w:abstractNum w:abstractNumId="2" w15:restartNumberingAfterBreak="0">
     <w:nsid w:val="4F787476"/>
     <w:multiLevelType w:val="hybridMultilevel"/>
     <w:tmpl w:val="5A3AB6B2"/>
@@ -675,7 +836,120 @@
       </w:rPr>
     </w:lvl>
   </w:abstractNum>
-  <w:abstractNum w:abstractNumId="2" w15:restartNumberingAfterBreak="0">
+  <w:abstractNum w:abstractNumId="3" w15:restartNumberingAfterBreak="0">
+    <w:nsid w:val="5C852EC5"/>
+    <w:multiLevelType w:val="hybridMultilevel"/>
+    <w:tmpl w:val="F9DC0D80"/>
+    <w:lvl w:ilvl="0" w:tplc="08090001">
+      <w:start w:val="1"/>
+      <w:numFmt w:val="bullet"/>
+      <w:lvlText w:val=""/>
+      <w:lvlJc w:val="left"/>
+      <w:pPr>
+        <w:ind w:left="720" w:hanging="360"/>
+      </w:pPr>
+      <w:rPr>
+        <w:rFonts w:ascii="Symbol" w:hAnsi="Symbol" w:hint="default"/>
+      </w:rPr>
+    </w:lvl>
+    <w:lvl w:ilvl="1" w:tplc="08090003" w:tentative="1">
+      <w:start w:val="1"/>
+      <w:numFmt w:val="bullet"/>
+      <w:lvlText w:val="o"/>
+      <w:lvlJc w:val="left"/>
+      <w:pPr>
+        <w:ind w:left="1440" w:hanging="360"/>
+      </w:pPr>
+      <w:rPr>
+        <w:rFonts w:ascii="Courier New" w:hAnsi="Courier New" w:cs="Courier New" w:hint="default"/>
+      </w:rPr>
+    </w:lvl>
+    <w:lvl w:ilvl="2" w:tplc="08090005" w:tentative="1">
+      <w:start w:val="1"/>
+      <w:numFmt w:val="bullet"/>
+      <w:lvlText w:val=""/>
+      <w:lvlJc w:val="left"/>
+      <w:pPr>
+        <w:ind w:left="2160" w:hanging="360"/>
+      </w:pPr>
+      <w:rPr>
+        <w:rFonts w:ascii="Wingdings" w:hAnsi="Wingdings" w:hint="default"/>
+      </w:rPr>
+    </w:lvl>
+    <w:lvl w:ilvl="3" w:tplc="08090001" w:tentative="1">
+      <w:start w:val="1"/>
+      <w:numFmt w:val="bullet"/>
+      <w:lvlText w:val=""/>
+      <w:lvlJc w:val="left"/>
+      <w:pPr>
+        <w:ind w:left="2880" w:hanging="360"/>
+      </w:pPr>
+      <w:rPr>
+        <w:rFonts w:ascii="Symbol" w:hAnsi="Symbol" w:hint="default"/>
+      </w:rPr>
+    </w:lvl>
+    <w:lvl w:ilvl="4" w:tplc="08090003" w:tentative="1">
+      <w:start w:val="1"/>
+      <w:numFmt w:val="bullet"/>
+      <w:lvlText w:val="o"/>
+      <w:lvlJc w:val="left"/>
+      <w:pPr>
+        <w:ind w:left="3600" w:hanging="360"/>
+      </w:pPr>
+      <w:rPr>
+        <w:rFonts w:ascii="Courier New" w:hAnsi="Courier New" w:cs="Courier New" w:hint="default"/>
+      </w:rPr>
+    </w:lvl>
+    <w:lvl w:ilvl="5" w:tplc="08090005" w:tentative="1">
+      <w:start w:val="1"/>
+      <w:numFmt w:val="bullet"/>
+      <w:lvlText w:val=""/>
+      <w:lvlJc w:val="left"/>
+      <w:pPr>
+        <w:ind w:left="4320" w:hanging="360"/>
+      </w:pPr>
+      <w:rPr>
+        <w:rFonts w:ascii="Wingdings" w:hAnsi="Wingdings" w:hint="default"/>
+      </w:rPr>
+    </w:lvl>
+    <w:lvl w:ilvl="6" w:tplc="08090001" w:tentative="1">
+      <w:start w:val="1"/>
+      <w:numFmt w:val="bullet"/>
+      <w:lvlText w:val=""/>
+      <w:lvlJc w:val="left"/>
+      <w:pPr>
+        <w:ind w:left="5040" w:hanging="360"/>
+      </w:pPr>
+      <w:rPr>
+        <w:rFonts w:ascii="Symbol" w:hAnsi="Symbol" w:hint="default"/>
+      </w:rPr>
+    </w:lvl>
+    <w:lvl w:ilvl="7" w:tplc="08090003" w:tentative="1">
+      <w:start w:val="1"/>
+      <w:numFmt w:val="bullet"/>
+      <w:lvlText w:val="o"/>
+      <w:lvlJc w:val="left"/>
+      <w:pPr>
+        <w:ind w:left="5760" w:hanging="360"/>
+      </w:pPr>
+      <w:rPr>
+        <w:rFonts w:ascii="Courier New" w:hAnsi="Courier New" w:cs="Courier New" w:hint="default"/>
+      </w:rPr>
+    </w:lvl>
+    <w:lvl w:ilvl="8" w:tplc="08090005" w:tentative="1">
+      <w:start w:val="1"/>
+      <w:numFmt w:val="bullet"/>
+      <w:lvlText w:val=""/>
+      <w:lvlJc w:val="left"/>
+      <w:pPr>
+        <w:ind w:left="6480" w:hanging="360"/>
+      </w:pPr>
+      <w:rPr>
+        <w:rFonts w:ascii="Wingdings" w:hAnsi="Wingdings" w:hint="default"/>
+      </w:rPr>
+    </w:lvl>
+  </w:abstractNum>
+  <w:abstractNum w:abstractNumId="4" w15:restartNumberingAfterBreak="0">
     <w:nsid w:val="6ADD746D"/>
     <w:multiLevelType w:val="hybridMultilevel"/>
     <w:tmpl w:val="BB2E75F8"/>
@@ -788,7 +1062,7 @@
       </w:rPr>
     </w:lvl>
   </w:abstractNum>
-  <w:abstractNum w:abstractNumId="3" w15:restartNumberingAfterBreak="0">
+  <w:abstractNum w:abstractNumId="5" w15:restartNumberingAfterBreak="0">
     <w:nsid w:val="6ED83090"/>
     <w:multiLevelType w:val="hybridMultilevel"/>
     <w:tmpl w:val="75E2C142"/>
@@ -802,6 +1076,118 @@
       </w:pPr>
       <w:rPr>
         <w:rFonts w:ascii="Symbol" w:hAnsi="Symbol" w:hint="default"/>
+      </w:rPr>
+    </w:lvl>
+    <w:lvl w:ilvl="1" w:tplc="08090003" w:tentative="1">
+      <w:start w:val="1"/>
+      <w:numFmt w:val="bullet"/>
+      <w:lvlText w:val="o"/>
+      <w:lvlJc w:val="left"/>
+      <w:pPr>
+        <w:ind w:left="1440" w:hanging="360"/>
+      </w:pPr>
+      <w:rPr>
+        <w:rFonts w:ascii="Courier New" w:hAnsi="Courier New" w:cs="Courier New" w:hint="default"/>
+      </w:rPr>
+    </w:lvl>
+    <w:lvl w:ilvl="2" w:tplc="08090005" w:tentative="1">
+      <w:start w:val="1"/>
+      <w:numFmt w:val="bullet"/>
+      <w:lvlText w:val=""/>
+      <w:lvlJc w:val="left"/>
+      <w:pPr>
+        <w:ind w:left="2160" w:hanging="360"/>
+      </w:pPr>
+      <w:rPr>
+        <w:rFonts w:ascii="Wingdings" w:hAnsi="Wingdings" w:hint="default"/>
+      </w:rPr>
+    </w:lvl>
+    <w:lvl w:ilvl="3" w:tplc="08090001" w:tentative="1">
+      <w:start w:val="1"/>
+      <w:numFmt w:val="bullet"/>
+      <w:lvlText w:val=""/>
+      <w:lvlJc w:val="left"/>
+      <w:pPr>
+        <w:ind w:left="2880" w:hanging="360"/>
+      </w:pPr>
+      <w:rPr>
+        <w:rFonts w:ascii="Symbol" w:hAnsi="Symbol" w:hint="default"/>
+      </w:rPr>
+    </w:lvl>
+    <w:lvl w:ilvl="4" w:tplc="08090003" w:tentative="1">
+      <w:start w:val="1"/>
+      <w:numFmt w:val="bullet"/>
+      <w:lvlText w:val="o"/>
+      <w:lvlJc w:val="left"/>
+      <w:pPr>
+        <w:ind w:left="3600" w:hanging="360"/>
+      </w:pPr>
+      <w:rPr>
+        <w:rFonts w:ascii="Courier New" w:hAnsi="Courier New" w:cs="Courier New" w:hint="default"/>
+      </w:rPr>
+    </w:lvl>
+    <w:lvl w:ilvl="5" w:tplc="08090005" w:tentative="1">
+      <w:start w:val="1"/>
+      <w:numFmt w:val="bullet"/>
+      <w:lvlText w:val=""/>
+      <w:lvlJc w:val="left"/>
+      <w:pPr>
+        <w:ind w:left="4320" w:hanging="360"/>
+      </w:pPr>
+      <w:rPr>
+        <w:rFonts w:ascii="Wingdings" w:hAnsi="Wingdings" w:hint="default"/>
+      </w:rPr>
+    </w:lvl>
+    <w:lvl w:ilvl="6" w:tplc="08090001" w:tentative="1">
+      <w:start w:val="1"/>
+      <w:numFmt w:val="bullet"/>
+      <w:lvlText w:val=""/>
+      <w:lvlJc w:val="left"/>
+      <w:pPr>
+        <w:ind w:left="5040" w:hanging="360"/>
+      </w:pPr>
+      <w:rPr>
+        <w:rFonts w:ascii="Symbol" w:hAnsi="Symbol" w:hint="default"/>
+      </w:rPr>
+    </w:lvl>
+    <w:lvl w:ilvl="7" w:tplc="08090003" w:tentative="1">
+      <w:start w:val="1"/>
+      <w:numFmt w:val="bullet"/>
+      <w:lvlText w:val="o"/>
+      <w:lvlJc w:val="left"/>
+      <w:pPr>
+        <w:ind w:left="5760" w:hanging="360"/>
+      </w:pPr>
+      <w:rPr>
+        <w:rFonts w:ascii="Courier New" w:hAnsi="Courier New" w:cs="Courier New" w:hint="default"/>
+      </w:rPr>
+    </w:lvl>
+    <w:lvl w:ilvl="8" w:tplc="08090005" w:tentative="1">
+      <w:start w:val="1"/>
+      <w:numFmt w:val="bullet"/>
+      <w:lvlText w:val=""/>
+      <w:lvlJc w:val="left"/>
+      <w:pPr>
+        <w:ind w:left="6480" w:hanging="360"/>
+      </w:pPr>
+      <w:rPr>
+        <w:rFonts w:ascii="Wingdings" w:hAnsi="Wingdings" w:hint="default"/>
+      </w:rPr>
+    </w:lvl>
+  </w:abstractNum>
+  <w:abstractNum w:abstractNumId="6" w15:restartNumberingAfterBreak="0">
+    <w:nsid w:val="74F47859"/>
+    <w:multiLevelType w:val="hybridMultilevel"/>
+    <w:tmpl w:val="5E9019FE"/>
+    <w:lvl w:ilvl="0" w:tplc="B6AA3EB0">
+      <w:numFmt w:val="bullet"/>
+      <w:lvlText w:val="-"/>
+      <w:lvlJc w:val="left"/>
+      <w:pPr>
+        <w:ind w:left="720" w:hanging="360"/>
+      </w:pPr>
+      <w:rPr>
+        <w:rFonts w:ascii="Aptos" w:eastAsiaTheme="minorEastAsia" w:hAnsi="Aptos" w:cstheme="minorBidi" w:hint="default"/>
       </w:rPr>
     </w:lvl>
     <w:lvl w:ilvl="1" w:tplc="08090003" w:tentative="1">
@@ -905,13 +1291,22 @@
     <w:abstractNumId w:val="0"/>
   </w:num>
   <w:num w:numId="2" w16cid:durableId="1533810995">
+    <w:abstractNumId w:val="5"/>
+  </w:num>
+  <w:num w:numId="3" w16cid:durableId="1758017914">
+    <w:abstractNumId w:val="2"/>
+  </w:num>
+  <w:num w:numId="4" w16cid:durableId="359862999">
+    <w:abstractNumId w:val="4"/>
+  </w:num>
+  <w:num w:numId="5" w16cid:durableId="295452518">
     <w:abstractNumId w:val="3"/>
   </w:num>
-  <w:num w:numId="3" w16cid:durableId="1758017914">
+  <w:num w:numId="6" w16cid:durableId="1365670869">
+    <w:abstractNumId w:val="6"/>
+  </w:num>
+  <w:num w:numId="7" w16cid:durableId="1245726494">
     <w:abstractNumId w:val="1"/>
-  </w:num>
-  <w:num w:numId="4" w16cid:durableId="359862999">
-    <w:abstractNumId w:val="2"/>
   </w:num>
 </w:numbering>
 </file>

</xml_diff>

<commit_message>
docs: continue refining MyStarExample narrative
</commit_message>
<xml_diff>
--- a/MyStarExample.docx
+++ b/MyStarExample.docx
@@ -239,15 +239,7 @@
         <w:pStyle w:val="BodyText"/>
       </w:pPr>
       <w:r>
-        <w:t xml:space="preserve">For bank statements — single-page but information-dense — extraction runs across multiple turns. Each </w:t>
-      </w:r>
-      <w:proofErr w:type="gramStart"/>
-      <w:r>
-        <w:t>turn's  output</w:t>
-      </w:r>
-      <w:proofErr w:type="gramEnd"/>
-      <w:r>
-        <w:t xml:space="preserve"> is injected into the next turn's prompt, giving the model the context it needs to work through the document progressively.</w:t>
+        <w:t>The workflow is defined as a directed graph in YAML. Nodes are VLM calls or routing decisions; edges are conditional transitions. Retry limits are declared in the same YAML, preventing runaway loops under production load.</w:t>
       </w:r>
     </w:p>
     <w:p>
@@ -256,14 +248,6 @@
       </w:pPr>
       <w:r>
         <w:lastRenderedPageBreak/>
-        <w:t>The workflow is defined as a directed graph in YAML. Nodes are VLM calls or routing decisions; edges are conditional transitions. Retry limits are declared in the same YAML, preventing runaway loops under production load.</w:t>
-      </w:r>
-    </w:p>
-    <w:p>
-      <w:pPr>
-        <w:pStyle w:val="BodyText"/>
-      </w:pPr>
-      <w:r>
         <w:t>We applied this declarative approach consistently: model registrations, document field schemas, extraction prompts, and workflow topologies are all configuration, not code. The execution engine reads its instructions — it doesn't contain them. Adding a new model requires one registry entry. Adding a new document type requires a field definition and a prompt. Neither requires pipeline code changes.</w:t>
       </w:r>
     </w:p>

</xml_diff>